<commit_message>
Enforce scan-wide request limits
</commit_message>
<xml_diff>
--- a/Sh4q_Academic_Project_Draft.docx
+++ b/Sh4q_Academic_Project_Draft.docx
@@ -716,6 +716,22 @@
     </ns0:p>
     <ns0:p xmlns:ns0="http://schemas.openxmlformats.org/wordprocessingml/2006/main">
       <ns0:pPr>
+        <ns0:pStyle ns0:val="Normal"/>
+      </ns0:pPr>
+      <ns0:r>
+        <ns0:t>9. One scan-wide request limiter now enforces concurrency, pacing, and total budget at the HTTP transport boundary.</ns0:t>
+      </ns0:r>
+    </ns0:p>
+    <ns0:p xmlns:ns0="http://schemas.openxmlformats.org/wordprocessingml/2006/main">
+      <ns0:pPr>
+        <ns0:pStyle ns0:val="ListNumber"/>
+      </ns0:pPr>
+      <ns0:r>
+        <ns0:t>Scope validation does not consume request budget; each real redirect, fallback-IP, pagination, or retry attempt does.</ns0:t>
+      </ns0:r>
+    </ns0:p>
+    <ns0:p xmlns:ns0="http://schemas.openxmlformats.org/wordprocessingml/2006/main">
+      <ns0:pPr>
         <ns0:pStyle ns0:val="Heading2"/>
       </ns0:pPr>
       <ns0:r>
@@ -791,6 +807,14 @@
         <ns0:pStyle ns0:val="ListBullet"/>
       </ns0:pPr>
       <ns0:r>
+        <ns0:t>Request admissions, budget denials, failures, and peak concurrency.</ns0:t>
+      </ns0:r>
+    </ns0:p>
+    <ns0:p xmlns:ns0="http://schemas.openxmlformats.org/wordprocessingml/2006/main">
+      <ns0:pPr>
+        <ns0:pStyle ns0:val="ListBullet"/>
+      </ns0:pPr>
+      <ns0:r>
         <ns0:t>Test pass rate.</ns0:t>
       </ns0:r>
     </ns0:p>
@@ -823,7 +847,7 @@
         <ns0:pStyle ns0:val="Normal"/>
       </ns0:pPr>
       <ns0:r>
-        <ns0:t>Controlled tests demonstrate blocked out-of-scope redirects, reserved-address rejection, DNS-rebinding resistance through IP pinning, preserved TLS hostname identity, URL deduplication, and retained CT partial results. A preliminary SQLite concurrency run completed 50 parallel synthetic work units in approximately 0.669 seconds and produced the expected 100 nodes, 50 relationships, 50 event-log records, and 50 evidence records without observed lock errors or lost writes. This single run is engineering evidence rather than a final benchmark; the formal evaluation should repeat the experiment and report descriptive statistics. Live-domain runs exposed realistic DNS latency, HTTP timeout, CT degradation, and rate-limit conditions. These runs informed corrections but are not a substitute for controlled evaluation.</ns0:t>
+        <ns0:t>Controlled tests demonstrate blocked out-of-scope redirects, reserved-address rejection, DNS-rebinding resistance through IP pinning, preserved TLS hostname identity, URL deduplication, retained CT partial results, bounded request concurrency, paced admissions, and budget denial before transport contact. A preliminary SQLite concurrency run completed 50 parallel synthetic work units in approximately 0.669 seconds and produced the expected 100 nodes, 50 relationships, 50 event-log records, and 50 evidence records without observed lock errors or lost writes. This single run is engineering evidence rather than a final benchmark; the thesis evaluation must repeat the experiment several times and report mean, median, minimum, maximum, and standard deviation. Live-domain runs exposed realistic DNS latency, HTTP timeout, CT degradation, and rate-limit conditions. These runs informed corrections but are not a substitute for controlled evaluation.</ns0:t>
       </ns0:r>
     </ns0:p>
     <ns0:p xmlns:ns0="http://schemas.openxmlformats.org/wordprocessingml/2006/main">
@@ -839,7 +863,7 @@
         <ns0:pStyle ns0:val="Normal"/>
       </ns0:pPr>
       <ns0:r>
-        <ns0:t>Event dispatch failure handling and dead-letter states are incomplete. Configured request-rate and concurrency limits are not yet enforced. SQLite schema migration and CI are absent. Tests remain a mixture of assertions and older print-based scripts. Discovery breadth is intentionally limited. Gate 1 is functionally complete for the current DNS, HTTP, and CT paths, with follow-up hardening tracked in `architecture.md`. Stage output is now ordered by draining each plugin stage before the next begins; interrupted plugin execution is still rerun rather than resumed at plugin-attempt granularity.</ns0:t>
+        <ns0:t>Durable event retries, dead-letter handling, recovery, and clean interruption are implemented. Request-rate, concurrency, and total-budget controls are enforced for the current HTTP and CT paths, but future adapters still require a non-bypassable controlled-network contract and richer durable request metrics. SQLite schema migration and CI are absent. Tests remain a mixture of assertions and older executable scripts. Discovery breadth is intentionally limited. Gate 1 is functionally complete for the current DNS, HTTP, and CT paths, with follow-up hardening tracked in `architecture.md`. Stage output is ordered by draining each plugin stage before the next begins; interrupted plugin execution is still rerun rather than resumed at plugin-attempt granularity.</ns0:t>
       </ns0:r>
     </ns0:p>
     <ns0:p xmlns:ns0="http://schemas.openxmlformats.org/wordprocessingml/2006/main">
@@ -927,7 +951,7 @@
         <ns0:pStyle ns0:val="Normal"/>
       </ns0:pPr>
       <ns0:r>
-        <ns0:t>Complete event failure recovery, rate limiting, request accounting, trusted-service networking, database hardening, CI, and formal evaluation. Add external-tool adapters only after these controls are complete.</ns0:t>
+        <ns0:t>Complete Gate 3 durable request accounting and adapter enforcement, then add schema migration, CI, and formal repeated evaluation. Add external-tool adapters only through the controlled execution and networking contracts.</ns0:t>
       </ns0:r>
     </ns0:p>
     <ns0:p xmlns:ns0="http://schemas.openxmlformats.org/wordprocessingml/2006/main">

</xml_diff>

<commit_message>
Persist request limiter metrics
</commit_message>
<xml_diff>
--- a/Sh4q_Academic_Project_Draft.docx
+++ b/Sh4q_Academic_Project_Draft.docx
@@ -728,6 +728,14 @@
       </ns0:pPr>
       <ns0:r>
         <ns0:t>Scope validation does not consume request budget; each real redirect, fallback-IP, pagination, or retry attempt does.</ns0:t>
+      </ns0:r>
+    </ns0:p>
+    <ns0:p xmlns:ns0="http://schemas.openxmlformats.org/wordprocessingml/2006/main">
+      <ns0:pPr>
+        <ns0:pStyle ns0:val="ListNumber"/>
+      </ns0:pPr>
+      <ns0:r>
+        <ns0:t>Request-limit configuration and observed counters are persisted as a `request_metrics` evidence record for each scan outcome.</ns0:t>
       </ns0:r>
     </ns0:p>
     <ns0:p xmlns:ns0="http://schemas.openxmlformats.org/wordprocessingml/2006/main">

</xml_diff>

<commit_message>
Define controlled external adapter contract
</commit_message>
<xml_diff>
--- a/Sh4q_Academic_Project_Draft.docx
+++ b/Sh4q_Academic_Project_Draft.docx
@@ -740,6 +740,14 @@
     </ns0:p>
     <ns0:p xmlns:ns0="http://schemas.openxmlformats.org/wordprocessingml/2006/main">
       <ns0:pPr>
+        <ns0:pStyle ns0:val="ListNumber"/>
+      </ns0:pPr>
+      <ns0:r>
+        <ns0:t>External-tool integration begins with a restricted adapter contract using shared policy services and argument arrays rather than shell command strings.</ns0:t>
+      </ns0:r>
+    </ns0:p>
+    <ns0:p xmlns:ns0="http://schemas.openxmlformats.org/wordprocessingml/2006/main">
+      <ns0:pPr>
         <ns0:pStyle ns0:val="Heading2"/>
       </ns0:pPr>
       <ns0:r>
@@ -960,6 +968,14 @@
       </ns0:pPr>
       <ns0:r>
         <ns0:t>Complete Gate 3 durable request accounting and adapter enforcement, then add schema migration, CI, and formal repeated evaluation. Add external-tool adapters only through the controlled execution and networking contracts.</ns0:t>
+      </ns0:r>
+    </ns0:p>
+    <ns0:p xmlns:ns0="http://schemas.openxmlformats.org/wordprocessingml/2006/main">
+      <ns0:pPr>
+        <ns0:pStyle ns0:val="Normal"/>
+      </ns0:pPr>
+      <ns0:r>
+        <ns0:t>Python was retained for the academic implementation because the system is currently I/O-bound and benefits from asyncio, HTTPX, Pydantic, SQLite support, and rapid security-tool integration. Go offers stronger binary distribution and runtime efficiency, but a rewrite would not itself solve scope-policy, evidence, retry, or adapter correctness and would require complete regression revalidation. Reconsider the language only after profiling demonstrates a concrete limitation.</ns0:t>
       </ns0:r>
     </ns0:p>
     <ns0:p xmlns:ns0="http://schemas.openxmlformats.org/wordprocessingml/2006/main">

</xml_diff>

<commit_message>
Add controlled adapter process runner
</commit_message>
<xml_diff>
--- a/Sh4q_Academic_Project_Draft.docx
+++ b/Sh4q_Academic_Project_Draft.docx
@@ -744,6 +744,14 @@
       </ns0:pPr>
       <ns0:r>
         <ns0:t>External-tool integration begins with a restricted adapter contract using shared policy services and argument arrays rather than shell command strings.</ns0:t>
+      </ns0:r>
+    </ns0:p>
+    <ns0:p xmlns:ns0="http://schemas.openxmlformats.org/wordprocessingml/2006/main">
+      <ns0:pPr>
+        <ns0:pStyle ns0:val="ListNumber"/>
+      </ns0:pPr>
+      <ns0:r>
+        <ns0:t>A controlled subprocess runner bounds executable choice, environment, runtime, output, cancellation, and process cleanup before adapter output is accepted.</ns0:t>
       </ns0:r>
     </ns0:p>
     <ns0:p xmlns:ns0="http://schemas.openxmlformats.org/wordprocessingml/2006/main">

</xml_diff>

<commit_message>
Validate external adapter output through Gate 2
</commit_message>
<xml_diff>
--- a/Sh4q_Academic_Project_Draft.docx
+++ b/Sh4q_Academic_Project_Draft.docx
@@ -752,6 +752,22 @@
       </ns0:pPr>
       <ns0:r>
         <ns0:t>A controlled subprocess runner bounds executable choice, environment, runtime, output, cancellation, and process cleanup before adapter output is accepted.</ns0:t>
+      </ns0:r>
+    </ns0:p>
+    <ns0:p xmlns:ns0="http://schemas.openxmlformats.org/wordprocessingml/2006/main">
+      <ns0:pPr>
+        <ns0:pStyle ns0:val="ListNumber"/>
+      </ns0:pPr>
+      <ns0:r>
+        <ns0:t>Adapter execution details and raw output are preserved as evidence, while parsed assets pass through the existing Gate 2 policy before graph storage.</ns0:t>
+      </ns0:r>
+    </ns0:p>
+    <ns0:p xmlns:ns0="http://schemas.openxmlformats.org/wordprocessingml/2006/main">
+      <ns0:pPr>
+        <ns0:pStyle ns0:val="ListNumber"/>
+      </ns0:pPr>
+      <ns0:r>
+        <ns0:t>The native Python request limiter is not misrepresented as control over packets generated inside external tools; stronger enforcement requires tool-specific restrictions and eventual OS-level containment.</ns0:t>
       </ns0:r>
     </ns0:p>
     <ns0:p xmlns:ns0="http://schemas.openxmlformats.org/wordprocessingml/2006/main">

</xml_diff>

<commit_message>
Add passive Subfinder adapter definition
</commit_message>
<xml_diff>
--- a/Sh4q_Academic_Project_Draft.docx
+++ b/Sh4q_Academic_Project_Draft.docx
@@ -768,6 +768,14 @@
       </ns0:pPr>
       <ns0:r>
         <ns0:t>The native Python request limiter is not misrepresented as control over packets generated inside external tools; stronger enforcement requires tool-specific restrictions and eventual OS-level containment.</ns0:t>
+      </ns0:r>
+    </ns0:p>
+    <ns0:p xmlns:ns0="http://schemas.openxmlformats.org/wordprocessingml/2006/main">
+      <ns0:pPr>
+        <ns0:pStyle ns0:val="ListNumber"/>
+      </ns0:pPr>
+      <ns0:r>
+        <ns0:t>The first planned real adapter is a passive Subfinder integration with fixed arguments and Gate 2 validation; it is not enabled in the default scan until offline integration and deployment checks pass.</ns0:t>
       </ns0:r>
     </ns0:p>
     <ns0:p xmlns:ns0="http://schemas.openxmlformats.org/wordprocessingml/2006/main">

</xml_diff>

<commit_message>
Correct unique asset reporting for adapters
</commit_message>
<xml_diff>
--- a/Sh4q_Academic_Project_Draft.docx
+++ b/Sh4q_Academic_Project_Draft.docx
@@ -776,6 +776,14 @@
       </ns0:pPr>
       <ns0:r>
         <ns0:t>The first real adapter is a passive, opt-in Subfinder integration exposed as `--sub`, with fixed arguments, an isolated configuration home, controlled execution evidence, deduplication, and Gate 2 validation. An offline scheduler test validates the complete orchestration path without internet access.</ns0:t>
+      </ns0:r>
+    </ns0:p>
+    <ns0:p xmlns:ns0="http://schemas.openxmlformats.org/wordprocessingml/2006/main">
+      <ns0:pPr>
+        <ns0:pStyle ns0:val="ListNumber"/>
+      </ns0:pPr>
+      <ns0:r>
+        <ns0:t>A live adapter run exposed overlap inflation between CT and Subfinder observations. Per-source counts are retained, but total assets and relationships now use unique identifiers; enumerated hostnames are not described as live endpoints without later resolution or probing.</ns0:t>
       </ns0:r>
     </ns0:p>
     <ns0:p xmlns:ns0="http://schemas.openxmlformats.org/wordprocessingml/2006/main">

</xml_diff>

<commit_message>
Resolve approved discovered hostnames
</commit_message>
<xml_diff>
--- a/Sh4q_Academic_Project_Draft.docx
+++ b/Sh4q_Academic_Project_Draft.docx
@@ -788,6 +788,14 @@
     </ns0:p>
     <ns0:p xmlns:ns0="http://schemas.openxmlformats.org/wordprocessingml/2006/main">
       <ns0:pPr>
+        <ns0:pStyle ns0:val="ListNumber"/>
+      </ns0:pPr>
+      <ns0:r>
+        <ns0:t>Approved Subfinder names now enter a bounded discovered-DNS stage only after pre-resolution scope authorization; reserved resolved addresses are denied before asset storage. HTTP probing of discovered names remains a separate risk-controlled phase.</ns0:t>
+      </ns0:r>
+    </ns0:p>
+    <ns0:p xmlns:ns0="http://schemas.openxmlformats.org/wordprocessingml/2006/main">
+      <ns0:pPr>
         <ns0:pStyle ns0:val="Heading2"/>
       </ns0:pPr>
       <ns0:r>
@@ -1032,6 +1040,14 @@
       </ns0:pPr>
       <ns0:r>
         <ns0:t>Sh4q provides a defensible foundation for authorised, auditable reconnaissance orchestration. Its contribution is not superior enumeration breadth but the central enforcement and evidence architecture through which specialised discovery tools can be coordinated safely.</ns0:t>
+      </ns0:r>
+    </ns0:p>
+    <ns0:p xmlns:ns0="http://schemas.openxmlformats.org/wordprocessingml/2006/main">
+      <ns0:pPr>
+        <ns0:pStyle ns0:val="Normal"/>
+      </ns0:pPr>
+      <ns0:r>
+        <ns0:t>The intended product is a policy and evidence control plane for attack-surface discovery. It can coordinate domain, API, certificate, cloud, and future mobile-backend discovery tools while preserving provenance and preventing unverified or out-of-scope observations from becoming trusted inventory.</ns0:t>
       </ns0:r>
     </ns0:p>
     <ns0:p xmlns:ns0="http://schemas.openxmlformats.org/wordprocessingml/2006/main">

</xml_diff>

<commit_message>
Preserve partial discovered DNS results
</commit_message>
<xml_diff>
--- a/Sh4q_Academic_Project_Draft.docx
+++ b/Sh4q_Academic_Project_Draft.docx
@@ -792,6 +792,14 @@
       </ns0:pPr>
       <ns0:r>
         <ns0:t>Approved Subfinder names now enter a bounded discovered-DNS stage only after pre-resolution scope authorization; reserved resolved addresses are denied before asset storage. HTTP probing of discovered names remains a separate risk-controlled phase.</ns0:t>
+      </ns0:r>
+    </ns0:p>
+    <ns0:p xmlns:ns0="http://schemas.openxmlformats.org/wordprocessingml/2006/main">
+      <ns0:pPr>
+        <ns0:pStyle ns0:val="ListNumber"/>
+      </ns0:pPr>
+      <ns0:r>
+        <ns0:t>A live large-batch run exposed timeout/retry amplification and partial-result loss in discovered DNS. Per-name timeouts, bounded concurrency, partial preservation, and compact reporting were added; the formal evaluation should measure these under controlled loads.</ns0:t>
       </ns0:r>
     </ns0:p>
     <ns0:p xmlns:ns0="http://schemas.openxmlformats.org/wordprocessingml/2006/main">

</xml_diff>

<commit_message>
Report adapter timeouts and preserve DNS handoff
</commit_message>
<xml_diff>
--- a/Sh4q_Academic_Project_Draft.docx
+++ b/Sh4q_Academic_Project_Draft.docx
@@ -800,6 +800,14 @@
       </ns0:pPr>
       <ns0:r>
         <ns0:t>A live large-batch run exposed timeout/retry amplification and partial-result loss in discovered DNS. Per-name timeouts, bounded concurrency, partial preservation, and compact reporting were added; the formal evaluation should measure these under controlled loads.</ns0:t>
+      </ns0:r>
+    </ns0:p>
+    <ns0:p xmlns:ns0="http://schemas.openxmlformats.org/wordprocessingml/2006/main">
+      <ns0:pPr>
+        <ns0:pStyle ns0:val="ListNumber"/>
+      </ns0:pPr>
+      <ns0:r>
+        <ns0:t>A later zero-result run was traced through execution evidence to a Subfinder process timeout rather than a genuine absence of findings. Explicit adapter-failure reporting, a bounded 120-second allowance, and source-specific stage hand-off were added.</ns0:t>
       </ns0:r>
     </ns0:p>
     <ns0:p xmlns:ns0="http://schemas.openxmlformats.org/wordprocessingml/2006/main">

</xml_diff>

<commit_message>
Improve scan measurement and reporting
</commit_message>
<xml_diff>
--- a/Sh4q_Academic_Project_Draft.docx
+++ b/Sh4q_Academic_Project_Draft.docx
@@ -812,6 +812,14 @@
     </ns0:p>
     <ns0:p xmlns:ns0="http://schemas.openxmlformats.org/wordprocessingml/2006/main">
       <ns0:pPr>
+        <ns0:pStyle ns0:val="ListNumber"/>
+      </ns0:pPr>
+      <ns0:r>
+        <ns0:t>Large-run reporting now separates current-scan evidence from historical stored evidence, labels native request metrics accurately, and reports discovered-DNS failures for reproducible performance analysis.</ns0:t>
+      </ns0:r>
+    </ns0:p>
+    <ns0:p xmlns:ns0="http://schemas.openxmlformats.org/wordprocessingml/2006/main">
+      <ns0:pPr>
         <ns0:pStyle ns0:val="Heading2"/>
       </ns0:pPr>
       <ns0:r>
@@ -1031,7 +1039,7 @@
         <ns0:pStyle ns0:val="Normal"/>
       </ns0:pPr>
       <ns0:r>
-        <ns0:t>Complete Gate 3 durable request accounting and adapter enforcement, then add schema migration, CI, and formal repeated evaluation. Add external-tool adapters only through the controlled execution and networking contracts.</ns0:t>
+        <ns0:t>Complete Gate 3 durable request accounting, adapter enforcement, and performance reporting, then add a human-friendly results/query interface, schema migration, CI, and formal repeated evaluation. Add external-tool adapters only through the controlled execution and networking contracts.</ns0:t>
       </ns0:r>
     </ns0:p>
     <ns0:p xmlns:ns0="http://schemas.openxmlformats.org/wordprocessingml/2006/main">

</xml_diff>

<commit_message>
Add non-SQL results views
</commit_message>
<xml_diff>
--- a/Sh4q_Academic_Project_Draft.docx
+++ b/Sh4q_Academic_Project_Draft.docx
@@ -816,6 +816,14 @@
       </ns0:pPr>
       <ns0:r>
         <ns0:t>Large-run reporting now separates current-scan evidence from historical stored evidence, labels native request metrics accurately, and reports discovered-DNS failures for reproducible performance analysis.</ns0:t>
+      </ns0:r>
+    </ns0:p>
+    <ns0:p xmlns:ns0="http://schemas.openxmlformats.org/wordprocessingml/2006/main">
+      <ns0:pPr>
+        <ns0:pStyle ns0:val="ListNumber"/>
+      </ns0:pPr>
+      <ns0:r>
+        <ns0:t>A first non-SQL `results` interface lists stored domains, IPs, URLs, and target-filtered failures. Exact per-scan asset views remain dependent on first-class scan-run ownership.</ns0:t>
       </ns0:r>
     </ns0:p>
     <ns0:p xmlns:ns0="http://schemas.openxmlformats.org/wordprocessingml/2006/main">

</xml_diff>

<commit_message>
Filter stored results by target
</commit_message>
<xml_diff>
--- a/Sh4q_Academic_Project_Draft.docx
+++ b/Sh4q_Academic_Project_Draft.docx
@@ -824,6 +824,14 @@
       </ns0:pPr>
       <ns0:r>
         <ns0:t>A first non-SQL `results` interface lists stored domains, IPs, URLs, and target-filtered failures. Exact per-scan asset views remain dependent on first-class scan-run ownership.</ns0:t>
+      </ns0:r>
+    </ns0:p>
+    <ns0:p xmlns:ns0="http://schemas.openxmlformats.org/wordprocessingml/2006/main">
+      <ns0:pPr>
+        <ns0:pStyle ns0:val="ListNumber"/>
+      </ns0:pPr>
+      <ns0:r>
+        <ns0:t>Asset target filtering uses exact-domain/subdomain boundaries; target IP views traverse stored resolution relationships rather than mixing unrelated database assets.</ns0:t>
       </ns0:r>
     </ns0:p>
     <ns0:p xmlns:ns0="http://schemas.openxmlformats.org/wordprocessingml/2006/main">

</xml_diff>

<commit_message>
Fix filtered result pagination
</commit_message>
<xml_diff>
--- a/Sh4q_Academic_Project_Draft.docx
+++ b/Sh4q_Academic_Project_Draft.docx
@@ -832,6 +832,14 @@
       </ns0:pPr>
       <ns0:r>
         <ns0:t>Asset target filtering uses exact-domain/subdomain boundaries; target IP views traverse stored resolution relationships rather than mixing unrelated database assets.</ns0:t>
+      </ns0:r>
+    </ns0:p>
+    <ns0:p xmlns:ns0="http://schemas.openxmlformats.org/wordprocessingml/2006/main">
+      <ns0:pPr>
+        <ns0:pStyle ns0:val="ListNumber"/>
+      </ns0:pPr>
+      <ns0:r>
+        <ns0:t>Result limiting now occurs after target matching; a discovered pagination defect previously produced inconsistent counts when filtering a global limited row set.</ns0:t>
       </ns0:r>
     </ns0:p>
     <ns0:p xmlns:ns0="http://schemas.openxmlformats.org/wordprocessingml/2006/main">

</xml_diff>

<commit_message>
Add durable scan run identity
</commit_message>
<xml_diff>
--- a/Sh4q_Academic_Project_Draft.docx
+++ b/Sh4q_Academic_Project_Draft.docx
@@ -840,6 +840,14 @@
       </ns0:pPr>
       <ns0:r>
         <ns0:t>Result limiting now occurs after target matching; a discovered pagination defect previously produced inconsistent counts when filtering a global limited row set.</ns0:t>
+      </ns0:r>
+    </ns0:p>
+    <ns0:p xmlns:ns0="http://schemas.openxmlformats.org/wordprocessingml/2006/main">
+      <ns0:pPr>
+        <ns0:pStyle ns0:val="ListNumber"/>
+      </ns0:pPr>
+      <ns0:r>
+        <ns0:t>Durable scan-run identity records target, start/completion time, and outcome for new executions. Historical runs are not backfilled with guessed identities; evidence and asset ownership migration remains the next step.</ns0:t>
       </ns0:r>
     </ns0:p>
     <ns0:p xmlns:ns0="http://schemas.openxmlformats.org/wordprocessingml/2006/main">

</xml_diff>

<commit_message>
Attach results to scan runs
</commit_message>
<xml_diff>
--- a/Sh4q_Academic_Project_Draft.docx
+++ b/Sh4q_Academic_Project_Draft.docx
@@ -848,6 +848,14 @@
       </ns0:pPr>
       <ns0:r>
         <ns0:t>Durable scan-run identity records target, start/completion time, and outcome for new executions. Historical runs are not backfilled with guessed identities; evidence and asset ownership migration remains the next step.</ns0:t>
+      </ns0:r>
+    </ns0:p>
+    <ns0:p xmlns:ns0="http://schemas.openxmlformats.org/wordprocessingml/2006/main">
+      <ns0:pPr>
+        <ns0:pStyle ns0:val="ListNumber"/>
+      </ns0:pPr>
+      <ns0:r>
+        <ns0:t>New evidence and accepted graph relationships now retain scan-run ownership, allowing exact run and latest-run result views while preserving the deduplicated global asset graph.</ns0:t>
       </ns0:r>
     </ns0:p>
     <ns0:p xmlns:ns0="http://schemas.openxmlformats.org/wordprocessingml/2006/main">

</xml_diff>

<commit_message>
Export scan results as JSON and CSV
</commit_message>
<xml_diff>
--- a/Sh4q_Academic_Project_Draft.docx
+++ b/Sh4q_Academic_Project_Draft.docx
@@ -856,6 +856,14 @@
       </ns0:pPr>
       <ns0:r>
         <ns0:t>New evidence and accepted graph relationships now retain scan-run ownership, allowing exact run and latest-run result views while preserving the deduplicated global asset graph.</ns0:t>
+      </ns0:r>
+    </ns0:p>
+    <ns0:p xmlns:ns0="http://schemas.openxmlformats.org/wordprocessingml/2006/main">
+      <ns0:pPr>
+        <ns0:pStyle ns0:val="ListNumber"/>
+      </ns0:pPr>
+      <ns0:r>
+        <ns0:t>Exact scan exports support structured JSON and spreadsheet-compatible CSV, include scan metadata and source provenance, avoid interactive result limits, and protect existing files from accidental overwrite.</ns0:t>
       </ns0:r>
     </ns0:p>
     <ns0:p xmlns:ns0="http://schemas.openxmlformats.org/wordprocessingml/2006/main">

</xml_diff>

<commit_message>
Explain non-exportable migration scans
</commit_message>
<xml_diff>
--- a/Sh4q_Academic_Project_Draft.docx
+++ b/Sh4q_Academic_Project_Draft.docx
@@ -864,6 +864,14 @@
       </ns0:pPr>
       <ns0:r>
         <ns0:t>Exact scan exports support structured JSON and spreadsheet-compatible CSV, include scan metadata and source provenance, avoid interactive result limits, and protect existing files from accidental overwrite.</ns0:t>
+      </ns0:r>
+    </ns0:p>
+    <ns0:p xmlns:ns0="http://schemas.openxmlformats.org/wordprocessingml/2006/main">
+      <ns0:pPr>
+        <ns0:pStyle ns0:val="ListNumber"/>
+      </ns0:pPr>
+      <ns0:r>
+        <ns0:t>Export detects migration-era runs that lack asset ownership and refuses misleading empty output; latest-run selection excludes unfinished executions while retaining them in the audit list.</ns0:t>
       </ns0:r>
     </ns0:p>
     <ns0:p xmlns:ns0="http://schemas.openxmlformats.org/wordprocessingml/2006/main">

</xml_diff>

<commit_message>
Fix scan asset ownership persistence
</commit_message>
<xml_diff>
--- a/Sh4q_Academic_Project_Draft.docx
+++ b/Sh4q_Academic_Project_Draft.docx
@@ -872,6 +872,14 @@
       </ns0:pPr>
       <ns0:r>
         <ns0:t>Export detects migration-era runs that lack asset ownership and refuses misleading empty output; latest-run selection excludes unfinished executions while retaining them in the audit list.</ns0:t>
+      </ns0:r>
+    </ns0:p>
+    <ns0:p xmlns:ns0="http://schemas.openxmlformats.org/wordprocessingml/2006/main">
+      <ns0:pPr>
+        <ns0:pStyle ns0:val="ListNumber"/>
+      </ns0:pPr>
+      <ns0:r>
+        <ns0:t>A live migration validation found and corrected a scan-ownership handler defect: counters could report accepted assets before per-scan ownership persistence succeeded. Exact results and export exposed the inconsistency; ownership is now written before counters are updated, with regression coverage. The affected historical run is excluded from exact export rather than guessed or backfilled.</ns0:t>
       </ns0:r>
     </ns0:p>
     <ns0:p xmlns:ns0="http://schemas.openxmlformats.org/wordprocessingml/2006/main">

</xml_diff>

<commit_message>
Add evidence-backed alive export filter
</commit_message>
<xml_diff>
--- a/Sh4q_Academic_Project_Draft.docx
+++ b/Sh4q_Academic_Project_Draft.docx
@@ -880,6 +880,14 @@
       </ns0:pPr>
       <ns0:r>
         <ns0:t>A live migration validation found and corrected a scan-ownership handler defect: counters could report accepted assets before per-scan ownership persistence succeeded. Exact results and export exposed the inconsistency; ownership is now written before counters are updated, with regression coverage. The affected historical run is excluded from exact export rather than guessed or backfilled.</ns0:t>
+      </ns0:r>
+    </ns0:p>
+    <ns0:p xmlns:ns0="http://schemas.openxmlformats.org/wordprocessingml/2006/main">
+      <ns0:pPr>
+        <ns0:pStyle ns0:val="ListNumber"/>
+      </ns0:pPr>
+      <ns0:r>
+        <ns0:t>Structured export supports an evidence-backed HTTP liveness view (`--alive http`), selecting domains with a scan-owned HTTP/HTTPS endpoint observation rather than treating passive discovery as proof of availability.</ns0:t>
       </ns0:r>
     </ns0:p>
     <ns0:p xmlns:ns0="http://schemas.openxmlformats.org/wordprocessingml/2006/main">

</xml_diff>

<commit_message>
Correct alive export ownership query
</commit_message>
<xml_diff>
--- a/Sh4q_Academic_Project_Draft.docx
+++ b/Sh4q_Academic_Project_Draft.docx
@@ -888,6 +888,14 @@
       </ns0:pPr>
       <ns0:r>
         <ns0:t>Structured export supports an evidence-backed HTTP liveness view (`--alive http`), selecting domains with a scan-owned HTTP/HTTPS endpoint observation rather than treating passive discovery as proof of availability.</ns0:t>
+      </ns0:r>
+    </ns0:p>
+    <ns0:p xmlns:ns0="http://schemas.openxmlformats.org/wordprocessingml/2006/main">
+      <ns0:pPr>
+        <ns0:pStyle ns0:val="ListNumber"/>
+      </ns0:pPr>
+      <ns0:r>
+        <ns0:t>Live export validation corrected an ownership-query assumption: HTTP liveness is derived from the scan-owned URL and `SERVES` relationship, and an empty filtered result is distinguished from an ownership-migration failure by checking the unfiltered ownership count.</ns0:t>
       </ns0:r>
     </ns0:p>
     <ns0:p xmlns:ns0="http://schemas.openxmlformats.org/wordprocessingml/2006/main">

</xml_diff>

<commit_message>
Include endpoint details in alive exports
</commit_message>
<xml_diff>
--- a/Sh4q_Academic_Project_Draft.docx
+++ b/Sh4q_Academic_Project_Draft.docx
@@ -896,6 +896,14 @@
       </ns0:pPr>
       <ns0:r>
         <ns0:t>Live export validation corrected an ownership-query assumption: HTTP liveness is derived from the scan-owned URL and `SERVES` relationship, and an empty filtered result is distinguished from an ownership-migration failure by checking the unfiltered ownership count.</ns0:t>
+      </ns0:r>
+    </ns0:p>
+    <ns0:p xmlns:ns0="http://schemas.openxmlformats.org/wordprocessingml/2006/main">
+      <ns0:pPr>
+        <ns0:pStyle ns0:val="ListNumber"/>
+      </ns0:pPr>
+      <ns0:r>
+        <ns0:t>HTTP-alive exports include the responding endpoint and status code, allowing the evaluation to verify the classification from stored evidence.</ns0:t>
       </ns0:r>
     </ns0:p>
     <ns0:p xmlns:ns0="http://schemas.openxmlformats.org/wordprocessingml/2006/main">

</xml_diff>

<commit_message>
Add DNS alive export filter
</commit_message>
<xml_diff>
--- a/Sh4q_Academic_Project_Draft.docx
+++ b/Sh4q_Academic_Project_Draft.docx
@@ -904,6 +904,14 @@
       </ns0:pPr>
       <ns0:r>
         <ns0:t>HTTP-alive exports include the responding endpoint and status code, allowing the evaluation to verify the classification from stored evidence.</ns0:t>
+      </ns0:r>
+    </ns0:p>
+    <ns0:p xmlns:ns0="http://schemas.openxmlformats.org/wordprocessingml/2006/main">
+      <ns0:pPr>
+        <ns0:pStyle ns0:val="ListNumber"/>
+      </ns0:pPr>
+      <ns0:r>
+        <ns0:t>DNS-alive exports provide one row per domain and permitted resolved address, distinguishing DNS liveness from HTTP liveness.</ns0:t>
       </ns0:r>
     </ns0:p>
     <ns0:p xmlns:ns0="http://schemas.openxmlformats.org/wordprocessingml/2006/main">

</xml_diff>

<commit_message>
Add controlled discovered HTTP enrichment
</commit_message>
<xml_diff>
--- a/Sh4q_Academic_Project_Draft.docx
+++ b/Sh4q_Academic_Project_Draft.docx
@@ -912,6 +912,14 @@
       </ns0:pPr>
       <ns0:r>
         <ns0:t>DNS-alive exports provide one row per domain and permitted resolved address, distinguishing DNS liveness from HTTP liveness.</ns0:t>
+      </ns0:r>
+    </ns0:p>
+    <ns0:p xmlns:ns0="http://schemas.openxmlformats.org/wordprocessingml/2006/main">
+      <ns0:pPr>
+        <ns0:pStyle ns0:val="ListNumber"/>
+      </ns0:pPr>
+      <ns0:r>
+        <ns0:t>A controlled discovered-HTTP enrichment stage probes only in-scope names with successful DNS observations, producing auditable HTTP status and endpoint evidence for liveness evaluation.</ns0:t>
       </ns0:r>
     </ns0:p>
     <ns0:p xmlns:ns0="http://schemas.openxmlformats.org/wordprocessingml/2006/main">

</xml_diff>

<commit_message>
Add parser-only httpx fingerprint candidate
</commit_message>
<xml_diff>
--- a/Sh4q_Academic_Project_Draft.docx
+++ b/Sh4q_Academic_Project_Draft.docx
@@ -920,6 +920,38 @@
       </ns0:pPr>
       <ns0:r>
         <ns0:t>A controlled discovered-HTTP enrichment stage probes only in-scope names with successful DNS observations, producing auditable HTTP status and endpoint evidence for liveness evaluation.</ns0:t>
+      </ns0:r>
+    </ns0:p>
+    <ns0:p xmlns:ns0="http://schemas.openxmlformats.org/wordprocessingml/2006/main">
+      <ns0:pPr>
+        <ns0:pStyle ns0:val="ListNumber"/>
+      </ns0:pPr>
+      <ns0:r>
+        <ns0:t>Live testing showed that public DNS timeouts can leave the enrichment stage with no eligible names; the system reports these failures and safely sends no HTTP requests. Offline fixtures provide repeatable validation independent of external DNS conditions.</ns0:t>
+      </ns0:r>
+    </ns0:p>
+    <ns0:p xmlns:ns0="http://schemas.openxmlformats.org/wordprocessingml/2006/main">
+      <ns0:pPr>
+        <ns0:pStyle ns0:val="ListNumber"/>
+      </ns0:pPr>
+      <ns0:r>
+        <ns0:t>A simple reachability utility such as `httprobe` was evaluated conceptually but deferred as an adapter because Sh4q's native HTTP enrichment already supplies equivalent probing plus scope, redirect, budget, and evidence controls. Any future comparison will use identical controlled inputs and repeated measurements.</ns0:t>
+      </ns0:r>
+    </ns0:p>
+    <ns0:p xmlns:ns0="http://schemas.openxmlformats.org/wordprocessingml/2006/main">
+      <ns0:pPr>
+        <ns0:pStyle ns0:val="ListNumber"/>
+      </ns0:pPr>
+      <ns0:r>
+        <ns0:t>Technology fingerprinting is planned as a separate enrichment stage over scan-owned HTTP endpoints. Fingerprints will preserve technology, category, version, detection method, confidence, tool provenance, timestamp, and raw evidence reference, and will be treated as observations rather than definitive version claims. Candidate tools will be selected only after controlled comparison.</ns0:t>
+      </ns0:r>
+    </ns0:p>
+    <ns0:p xmlns:ns0="http://schemas.openxmlformats.org/wordprocessingml/2006/main">
+      <ns0:pPr>
+        <ns0:pStyle ns0:val="ListNumber"/>
+      </ns0:pPr>
+      <ns0:r>
+        <ns0:t>ProjectDiscovery `httpx` was selected as the first parser-only fingerprinting candidate because it supplies structured JSONL. The candidate remains disabled in live scans until scan-owned endpoint input, redirect containment, and request-control implications are validated.</ns0:t>
       </ns0:r>
     </ns0:p>
     <ns0:p xmlns:ns0="http://schemas.openxmlformats.org/wordprocessingml/2006/main">

</xml_diff>

<commit_message>
Persist scoped technology fingerprints
</commit_message>
<xml_diff>
--- a/Sh4q_Academic_Project_Draft.docx
+++ b/Sh4q_Academic_Project_Draft.docx
@@ -952,6 +952,14 @@
       </ns0:pPr>
       <ns0:r>
         <ns0:t>ProjectDiscovery `httpx` was selected as the first parser-only fingerprinting candidate because it supplies structured JSONL. The candidate remains disabled in live scans until scan-owned endpoint input, redirect containment, and request-control implications are validated.</ns0:t>
+      </ns0:r>
+    </ns0:p>
+    <ns0:p xmlns:ns0="http://schemas.openxmlformats.org/wordprocessingml/2006/main">
+      <ns0:pPr>
+        <ns0:pStyle ns0:val="ListNumber"/>
+      </ns0:pPr>
+      <ns0:r>
+        <ns0:t>Offline fingerprint-pipeline validation shows that in-scope observations create normalized technology nodes and provenance-bearing relationships, while out-of-scope output remains evidence but is rejected from trusted asset state.</ns0:t>
       </ns0:r>
     </ns0:p>
     <ns0:p xmlns:ns0="http://schemas.openxmlformats.org/wordprocessingml/2006/main">

</xml_diff>

<commit_message>
Expose technology fingerprint results
</commit_message>
<xml_diff>
--- a/Sh4q_Academic_Project_Draft.docx
+++ b/Sh4q_Academic_Project_Draft.docx
@@ -960,6 +960,14 @@
       </ns0:pPr>
       <ns0:r>
         <ns0:t>Offline fingerprint-pipeline validation shows that in-scope observations create normalized technology nodes and provenance-bearing relationships, while out-of-scope output remains evidence but is rejected from trusted asset state.</ns0:t>
+      </ns0:r>
+    </ns0:p>
+    <ns0:p xmlns:ns0="http://schemas.openxmlformats.org/wordprocessingml/2006/main">
+      <ns0:pPr>
+        <ns0:pStyle ns0:val="ListNumber"/>
+      </ns0:pPr>
+      <ns0:r>
+        <ns0:t>Technology observations can be queried through the non-SQL results interface by exact scan or target, completing the presentation path before live fingerprint execution is introduced.</ns0:t>
       </ns0:r>
     </ns0:p>
     <ns0:p xmlns:ns0="http://schemas.openxmlformats.org/wordprocessingml/2006/main">

</xml_diff>

<commit_message>
Select scoped fingerprint inputs by scan
</commit_message>
<xml_diff>
--- a/Sh4q_Academic_Project_Draft.docx
+++ b/Sh4q_Academic_Project_Draft.docx
@@ -968,6 +968,14 @@
       </ns0:pPr>
       <ns0:r>
         <ns0:t>Technology observations can be queried through the non-SQL results interface by exact scan or target, completing the presentation path before live fingerprint execution is introduced.</ns0:t>
+      </ns0:r>
+    </ns0:p>
+    <ns0:p xmlns:ns0="http://schemas.openxmlformats.org/wordprocessingml/2006/main">
+      <ns0:pPr>
+        <ns0:pStyle ns0:val="ListNumber"/>
+      </ns0:pPr>
+      <ns0:r>
+        <ns0:t>Fingerprint input selection is constrained to HTTP(S) endpoints owned by the selected scan and reauthorised through the scope engine; unrelated historical, unsupported-scheme, and out-of-scope URLs are excluded before adapter execution.</ns0:t>
       </ns0:r>
     </ns0:p>
     <ns0:p xmlns:ns0="http://schemas.openxmlformats.org/wordprocessingml/2006/main">

</xml_diff>

<commit_message>
Add native HTTP header fingerprinting
</commit_message>
<xml_diff>
--- a/Sh4q_Academic_Project_Draft.docx
+++ b/Sh4q_Academic_Project_Draft.docx
@@ -976,6 +976,14 @@
       </ns0:pPr>
       <ns0:r>
         <ns0:t>Fingerprint input selection is constrained to HTTP(S) endpoints owned by the selected scan and reauthorised through the scope engine; unrelated historical, unsupported-scheme, and out-of-scope URLs are excluded before adapter execution.</ns0:t>
+      </ns0:r>
+    </ns0:p>
+    <ns0:p xmlns:ns0="http://schemas.openxmlformats.org/wordprocessingml/2006/main">
+      <ns0:pPr>
+        <ns0:pStyle ns0:val="ListNumber"/>
+      </ns0:pPr>
+      <ns0:r>
+        <ns0:t>Native fingerprinting reuses already-authorised HTTP responses and conservatively records explicit `Server` and `X-Powered-By` header observations with raw evidence and confidence labels. No additional request is generated, and header-based results are not treated as definitive software proof.</ns0:t>
       </ns0:r>
     </ns0:p>
     <ns0:p xmlns:ns0="http://schemas.openxmlformats.org/wordprocessingml/2006/main">

</xml_diff>

<commit_message>
Expand native technology fingerprinting
</commit_message>
<xml_diff>
--- a/Sh4q_Academic_Project_Draft.docx
+++ b/Sh4q_Academic_Project_Draft.docx
@@ -984,6 +984,14 @@
       </ns0:pPr>
       <ns0:r>
         <ns0:t>Native fingerprinting reuses already-authorised HTTP responses and conservatively records explicit `Server` and `X-Powered-By` header observations with raw evidence and confidence labels. No additional request is generated, and header-based results are not treated as definitive software proof.</ns0:t>
+      </ns0:r>
+    </ns0:p>
+    <ns0:p xmlns:ns0="http://schemas.openxmlformats.org/wordprocessingml/2006/main">
+      <ns0:pPr>
+        <ns0:pStyle ns0:val="ListNumber"/>
+      </ns0:pPr>
+      <ns0:r>
+        <ns0:t>The native signature engine evaluates a bounded 64 KiB HTML sample plus title, content type, cookie names, and selected headers. Versioned signatures cover conservative CMS, framework, CDN/WAF, runtime, and web-server signals; multiple independent observations increase confidence, while versions are recorded only when explicitly disclosed.</ns0:t>
       </ns0:r>
     </ns0:p>
     <ns0:p xmlns:ns0="http://schemas.openxmlformats.org/wordprocessingml/2006/main">

</xml_diff>

<commit_message>
Show endpoint fingerprint evidence
</commit_message>
<xml_diff>
--- a/Sh4q_Academic_Project_Draft.docx
+++ b/Sh4q_Academic_Project_Draft.docx
@@ -992,6 +992,14 @@
       </ns0:pPr>
       <ns0:r>
         <ns0:t>The native signature engine evaluates a bounded 64 KiB HTML sample plus title, content type, cookie names, and selected headers. Versioned signatures cover conservative CMS, framework, CDN/WAF, runtime, and web-server signals; multiple independent observations increase confidence, while versions are recorded only when explicitly disclosed.</ns0:t>
+      </ns0:r>
+    </ns0:p>
+    <ns0:p xmlns:ns0="http://schemas.openxmlformats.org/wordprocessingml/2006/main">
+      <ns0:pPr>
+        <ns0:pStyle ns0:val="ListNumber"/>
+      </ns0:pPr>
+      <ns0:r>
+        <ns0:t>Technology results are displayed per endpoint with status, category, confidence, version, and supporting signal. Evaluation distinguishes total discovered assets from HTTP-observed endpoints; passive names are not described as fingerprinted hosts.</ns0:t>
       </ns0:r>
     </ns0:p>
     <ns0:p xmlns:ns0="http://schemas.openxmlformats.org/wordprocessingml/2006/main">

</xml_diff>

<commit_message>
Use controlled async discovered DNS resolution
</commit_message>
<xml_diff>
--- a/Sh4q_Academic_Project_Draft.docx
+++ b/Sh4q_Academic_Project_Draft.docx
@@ -928,6 +928,14 @@
       </ns0:pPr>
       <ns0:r>
         <ns0:t>Live testing showed that public DNS timeouts can leave the enrichment stage with no eligible names; the system reports these failures and safely sends no HTTP requests. Offline fixtures provide repeatable validation independent of external DNS conditions.</ns0:t>
+      </ns0:r>
+    </ns0:p>
+    <ns0:p xmlns:ns0="http://schemas.openxmlformats.org/wordprocessingml/2006/main">
+      <ns0:pPr>
+        <ns0:pStyle ns0:val="Normal"/>
+      </ns0:pPr>
+      <ns0:r>
+        <ns0:t>35a. Discovered-host resolution was migrated from thread-backed system `getaddrinfo` to an asynchronous DNS resolver with explicit A/AAAA handling, caching, partial-family retention, bounded concurrency, and reason-specific failure reporting. This addresses resolver saturation observed in live runs and improves measurement correctness.</ns0:t>
       </ns0:r>
     </ns0:p>
     <ns0:p xmlns:ns0="http://schemas.openxmlformats.org/wordprocessingml/2006/main">

</xml_diff>

<commit_message>
Reuse discovered DNS addresses for HTTP probes
</commit_message>
<xml_diff>
--- a/Sh4q_Academic_Project_Draft.docx
+++ b/Sh4q_Academic_Project_Draft.docx
@@ -936,6 +936,14 @@
       </ns0:pPr>
       <ns0:r>
         <ns0:t>35a. Discovered-host resolution was migrated from thread-backed system `getaddrinfo` to an asynchronous DNS resolver with explicit A/AAAA handling, caching, partial-family retention, bounded concurrency, and reason-specific failure reporting. This addresses resolver saturation observed in live runs and improves measurement correctness.</ns0:t>
+      </ns0:r>
+    </ns0:p>
+    <ns0:p xmlns:ns0="http://schemas.openxmlformats.org/wordprocessingml/2006/main">
+      <ns0:pPr>
+        <ns0:pStyle ns0:val="Normal"/>
+      </ns0:pPr>
+      <ns0:r>
+        <ns0:t>35b. A subsequent live run resolved 105 discovered names and separated 337 NXDOMAIN failures from 58 timeouts. It also identified redundant HTTP-stage DNS resolution; authorised addresses are now handed directly to the scoped transport for the initial connection, while redirects remain independently resolved and authorised.</ns0:t>
       </ns0:r>
     </ns0:p>
     <ns0:p xmlns:ns0="http://schemas.openxmlformats.org/wordprocessingml/2006/main">

</xml_diff>

<commit_message>
Polish technology reporting and export
</commit_message>
<xml_diff>
--- a/Sh4q_Academic_Project_Draft.docx
+++ b/Sh4q_Academic_Project_Draft.docx
@@ -1016,6 +1016,14 @@
       </ns0:pPr>
       <ns0:r>
         <ns0:t>Technology results are displayed per endpoint with status, category, confidence, version, and supporting signal. Evaluation distinguishes total discovered assets from HTTP-observed endpoints; passive names are not described as fingerprinted hosts.</ns0:t>
+      </ns0:r>
+    </ns0:p>
+    <ns0:p xmlns:ns0="http://schemas.openxmlformats.org/wordprocessingml/2006/main">
+      <ns0:pPr>
+        <ns0:pStyle ns0:val="ListNumber"/>
+      </ns0:pPr>
+      <ns0:r>
+        <ns0:t>Technology reporting uses a compact endpoint-aware table and structured CSV/JSON export. More specific signature categories override generic server labels in new observations, while historical evidence remains immutable for reproducibility.</ns0:t>
       </ns0:r>
     </ns0:p>
     <ns0:p xmlns:ns0="http://schemas.openxmlformats.org/wordprocessingml/2006/main">

</xml_diff>

<commit_message>
Add persisted scan overview
</commit_message>
<xml_diff>
--- a/Sh4q_Academic_Project_Draft.docx
+++ b/Sh4q_Academic_Project_Draft.docx
@@ -1024,6 +1024,14 @@
       </ns0:pPr>
       <ns0:r>
         <ns0:t>Technology reporting uses a compact endpoint-aware table and structured CSV/JSON export. More specific signature categories override generic server labels in new observations, while historical evidence remains immutable for reproducibility.</ns0:t>
+      </ns0:r>
+    </ns0:p>
+    <ns0:p xmlns:ns0="http://schemas.openxmlformats.org/wordprocessingml/2006/main">
+      <ns0:pPr>
+        <ns0:pStyle ns0:val="ListNumber"/>
+      </ns0:pPr>
+      <ns0:r>
+        <ns0:t>A persisted scan-overview command separates verified surface, stored records, categorized failures, per-source ownership, and durable request metrics without requiring SQL. Stage timing persistence remains follow-up work rather than being inferred retrospectively.</ns0:t>
       </ns0:r>
     </ns0:p>
     <ns0:p xmlns:ns0="http://schemas.openxmlformats.org/wordprocessingml/2006/main">

</xml_diff>

<commit_message>
Add SQLite schema version safeguards
</commit_message>
<xml_diff>
--- a/Sh4q_Academic_Project_Draft.docx
+++ b/Sh4q_Academic_Project_Draft.docx
@@ -1032,6 +1032,22 @@
       </ns0:pPr>
       <ns0:r>
         <ns0:t>A persisted scan-overview command separates verified surface, stored records, categorized failures, per-source ownership, and durable request metrics without requiring SQL. Stage timing persistence remains follow-up work rather than being inferred retrospectively.</ns0:t>
+      </ns0:r>
+    </ns0:p>
+    <ns0:p xmlns:ns0="http://schemas.openxmlformats.org/wordprocessingml/2006/main">
+      <ns0:pPr>
+        <ns0:pStyle ns0:val="ListNumber"/>
+      </ns0:pPr>
+      <ns0:r>
+        <ns0:t>SQLite storage now records schema version 1, rejects unsupported newer schemas, establishes WAL during initialization, and consistently applies busy timeout and foreign-key settings. A 50-work-unit parallel validation completed with all expected nodes, relationships, events, and evidence records.</ns0:t>
+      </ns0:r>
+    </ns0:p>
+    <ns0:p xmlns:ns0="http://schemas.openxmlformats.org/wordprocessingml/2006/main">
+      <ns0:pPr>
+        <ns0:pStyle ns0:val="ListNumber"/>
+      </ns0:pPr>
+      <ns0:r>
+        <ns0:t>The private-alpha preparation plan includes a restrained ASCII identity and consistent table-based CLI presentation, while preserving plain-text output and prioritising evidence clarity over decoration.</ns0:t>
       </ns0:r>
     </ns0:p>
     <ns0:p xmlns:ns0="http://schemas.openxmlformats.org/wordprocessingml/2006/main">

</xml_diff>

<commit_message>
Standardize offline tests and CI
</commit_message>
<xml_diff>
--- a/Sh4q_Academic_Project_Draft.docx
+++ b/Sh4q_Academic_Project_Draft.docx
@@ -1048,6 +1048,14 @@
       </ns0:pPr>
       <ns0:r>
         <ns0:t>The private-alpha preparation plan includes a restrained ASCII identity and consistent table-based CLI presentation, while preserving plain-text output and prioritising evidence clarity over decoration.</ns0:t>
+      </ns0:r>
+    </ns0:p>
+    <ns0:p xmlns:ns0="http://schemas.openxmlformats.org/wordprocessingml/2006/main">
+      <ns0:pPr>
+        <ns0:pStyle ns0:val="ListNumber"/>
+      </ns0:pPr>
+      <ns0:r>
+        <ns0:t>A deterministic offline runner standardizes 36 assertion-based scripts with timeout enforcement, failure capture, durations, and process exit status. The initial aggregate run passed 36/36 tests in 13.25 seconds, and CI executes the same suite across Python 3.11-3.13.</ns0:t>
       </ns0:r>
     </ns0:p>
     <ns0:p xmlns:ns0="http://schemas.openxmlformats.org/wordprocessingml/2006/main">

</xml_diff>

<commit_message>
Persist stage performance metrics
</commit_message>
<xml_diff>
--- a/Sh4q_Academic_Project_Draft.docx
+++ b/Sh4q_Academic_Project_Draft.docx
@@ -1056,6 +1056,14 @@
       </ns0:pPr>
       <ns0:r>
         <ns0:t>A deterministic offline runner standardizes 36 assertion-based scripts with timeout enforcement, failure capture, durations, and process exit status. The initial aggregate run passed 36/36 tests in 13.25 seconds, and CI executes the same suite across Python 3.11-3.13.</ns0:t>
+      </ns0:r>
+    </ns0:p>
+    <ns0:p xmlns:ns0="http://schemas.openxmlformats.org/wordprocessingml/2006/main">
+      <ns0:pPr>
+        <ns0:pStyle ns0:val="ListNumber"/>
+      </ns0:pPr>
+      <ns0:r>
+        <ns0:t>Ordered stage metrics are persisted per scan with status, attempts, discovery count, duration, and cleanup errors. Historical overview reports can therefore support repeated performance evaluation without relying on copied terminal output. The expanded offline suite passed 37/37 tests in 12.89 seconds.</ns0:t>
       </ns0:r>
     </ns0:p>
     <ns0:p xmlns:ns0="http://schemas.openxmlformats.org/wordprocessingml/2006/main">

</xml_diff>